<commit_message>
Update docs for Appetize and API URL
</commit_message>
<xml_diff>
--- a/Reports_DOCX/Отчет_ЛР1_Стасев_ИТП41.docx
+++ b/Reports_DOCX/Отчет_ЛР1_Стасев_ИТП41.docx
@@ -324,12 +324,7 @@
         <w:jc w:val="both"/>
       </w:pPr>
       <w:r>
-        <w:rPr>
-          <w:rFonts w:ascii="Times New Roman" w:cs="Times New Roman" w:eastAsia="Times New Roman" w:hAnsi="Times New Roman"/>
-          <w:sz w:val="28"/>
-          <w:szCs w:val="28"/>
-        </w:rPr>
-        <w:t xml:space="preserve">Приложение реализовано на декларативном стеке Apple: язык программирования Swift, интерфейс пользователя SwiftUI, минимальная версия iOS/iPadOS 17. Исходный код размещён в открытом репозитории GitHub: https://github.com/stasev/RPiPiP-DiscountCards. Состояние проекта на момент сдачи лабораторной работы зафиксировано тегом lab1.</w:t>
+        <w:t>Приложение реализовано на декларативном стеке Apple: язык программирования Swift, интерфейс пользователя SwiftUI, минимальная версия iOS/iPadOS 17. Исходный код размещён в открытом репозитории GitHub: https://github.com/stasevboris/RPiPiP-DiscountCards. Состояние проекта на момент сдачи лабораторной работы зафиксировано тегом lab1.</w:t>
       </w:r>
     </w:p>
     <w:p>

</xml_diff>